<commit_message>
Add the Quick Import file for the 6-part form
THIET_KE_6_PHAN.docx is a document to read; importing it into Forms turns
every paragraph into a text question. NHAP_FORMS_6_PHAN.docx holds only
section titles, numbered questions and lettered options: 6 parts, 162
questions, each prefixed with a [code] so the Excel export can be read.
Exam options use the same fixed shuffle as the HTML simulation. The
design document now says not to import it and points to the new file.

Co-Authored-By: Claude Opus 5.5 <noreply@anthropic.com>
Claude-Session: https://claude.ai/code/session_011YvVpnNpPKoWNFXd1cS6v3
</commit_message>
<xml_diff>
--- a/mau_forms_thi_clb/THIET_KE_6_PHAN.docx
+++ b/mau_forms_thi_clb/THIET_KE_6_PHAN.docx
@@ -16,6 +16,20 @@
           <w:i/>
         </w:rPr>
         <w:t>Bản thiết kế đã duyệt. Tài liệu này giải thích cách biểu mẫu hoạt động và minh hoạ bằng một học sinh điền thử.</w:t>
+      </w:r>
+    </w:p>
+    <w:p>
+      <w:r>
+        <w:rPr>
+          <w:b/>
+        </w:rPr>
+        <w:t xml:space="preserve">Lưu ý: </w:t>
+      </w:r>
+      <w:r>
+        <w:rPr>
+          <w:i w:val="0"/>
+        </w:rPr>
+        <w:t>Tệp này để đọc. Đừng nhập tệp này vào Forms. Tệp để nhập là NHAP_FORMS_6_PHAN.docx.</w:t>
       </w:r>
     </w:p>
     <w:p>
@@ -3571,7 +3585,7 @@
         <w:pStyle w:val="ListNumber"/>
       </w:pPr>
       <w:r>
-        <w:t>Tạo biểu mẫu dạng Quiz, đặt tên “Đăng ký CLB và thi tuyển”.</w:t>
+        <w:t>Trên forms.office.com chọn Quick import, chọn tệp NHAP_FORMS_6_PHAN.docx, chọn dạng Quiz. Không nhập tệp tài liệu này.</w:t>
       </w:r>
     </w:p>
     <w:p>
@@ -3579,7 +3593,7 @@
         <w:pStyle w:val="ListNumber"/>
       </w:pPr>
       <w:r>
-        <w:t>Phần 1: thêm 2 câu Văn bản (Text): Mã học sinh, Họ và tên. Đặt bắt buộc.</w:t>
+        <w:t>Kiểm tra lại: đủ 6 phần, 162 câu, câu nào có lựa chọn thì vẫn là câu chọn một.</w:t>
       </w:r>
     </w:p>
     <w:p>
@@ -3587,7 +3601,7 @@
         <w:pStyle w:val="ListNumber"/>
       </w:pPr>
       <w:r>
-        <w:t>Thêm Phần 2 (Thứ Hai). Thêm câu mở buổi (chọn một), câu xếp hạng (Ranking) 10 CLB, rồi lần lượt với từng CLB: câu “Thi CLB ...?” có 3 lựa chọn, và ngay sau đó 2 câu đề thi.</w:t>
+        <w:t>Đổi 5 câu xếp hạng (mã [thu_2] tới [thu_6]) sang dạng Ranking, giữ nguyên chữ và các lựa chọn.</w:t>
       </w:r>
     </w:p>
     <w:p>
@@ -3611,7 +3625,7 @@
         <w:pStyle w:val="ListNumber"/>
       </w:pPr>
       <w:r>
-        <w:t>Đặt rẽ nhánh theo bảng ở mục 5.</w:t>
+        <w:t>Đặt rẽ nhánh theo bảng ở mục 5. Các buổi khác đặt theo cùng quy tắc.</w:t>
       </w:r>
     </w:p>
     <w:p>
@@ -3619,7 +3633,15 @@
         <w:pStyle w:val="ListNumber"/>
       </w:pPr>
       <w:r>
-        <w:t>Lặp lại cho Phần 3 tới Phần 6 (Thứ Ba tới Thứ Sáu).</w:t>
+        <w:t>Làm như vậy cho cả 5 buổi, Phần 2 tới Phần 6.</w:t>
+      </w:r>
+    </w:p>
+    <w:p>
+      <w:pPr>
+        <w:pStyle w:val="ListNumber"/>
+      </w:pPr>
+      <w:r>
+        <w:t>Giữ nguyên phần [mã] ở đầu mỗi câu hỏi. Bộ chuyển đổi dựa vào mã này để đọc tệp Excel.</w:t>
       </w:r>
     </w:p>
     <w:p>

</xml_diff>